<commit_message>
logboeken! en mijn onderzoek
</commit_message>
<xml_diff>
--- a/Documentatie/logboek/logboek merel.docx
+++ b/Documentatie/logboek/logboek merel.docx
@@ -3,21 +3,16 @@
 <w:document xmlns:wpc="http://schemas.microsoft.com/office/word/2010/wordprocessingCanvas" xmlns:cx="http://schemas.microsoft.com/office/drawing/2014/chartex" xmlns:cx1="http://schemas.microsoft.com/office/drawing/2015/9/8/chartex" xmlns:cx2="http://schemas.microsoft.com/office/drawing/2015/10/21/chartex" xmlns:cx3="http://schemas.microsoft.com/office/drawing/2016/5/9/chartex" xmlns:cx4="http://schemas.microsoft.com/office/drawing/2016/5/10/chartex" xmlns:cx5="http://schemas.microsoft.com/office/drawing/2016/5/11/chartex" xmlns:cx6="http://schemas.microsoft.com/office/drawing/2016/5/12/chartex" xmlns:cx7="http://schemas.microsoft.com/office/drawing/2016/5/13/chartex" xmlns:cx8="http://schemas.microsoft.com/office/drawing/2016/5/14/chartex" xmlns:mc="http://schemas.openxmlformats.org/markup-compatibility/2006" xmlns:aink="http://schemas.microsoft.com/office/drawing/2016/ink" xmlns:am3d="http://schemas.microsoft.com/office/drawing/2017/model3d" xmlns:o="urn:schemas-microsoft-com:office:office" xmlns:oel="http://schemas.microsoft.com/office/2019/extlst" xmlns:r="http://schemas.openxmlformats.org/officeDocument/2006/relationships" xmlns:m="http://schemas.openxmlformats.org/officeDocument/2006/math" xmlns:v="urn:schemas-microsoft-com:vml" xmlns:wp14="http://schemas.microsoft.com/office/word/2010/wordprocessingDrawing" xmlns:wp="http://schemas.openxmlformats.org/drawingml/2006/wordprocessingDrawing" xmlns:w10="urn:schemas-microsoft-com:office:word" xmlns:w="http://schemas.openxmlformats.org/wordprocessingml/2006/main" xmlns:w14="http://schemas.microsoft.com/office/word/2010/wordml" xmlns:w15="http://schemas.microsoft.com/office/word/2012/wordml" xmlns:w16cex="http://schemas.microsoft.com/office/word/2018/wordml/cex" xmlns:w16cid="http://schemas.microsoft.com/office/word/2016/wordml/cid" xmlns:w16="http://schemas.microsoft.com/office/word/2018/wordml" xmlns:w16du="http://schemas.microsoft.com/office/word/2023/wordml/word16du" xmlns:w16sdtdh="http://schemas.microsoft.com/office/word/2020/wordml/sdtdatahash" xmlns:w16sdtfl="http://schemas.microsoft.com/office/word/2024/wordml/sdtformatlock" xmlns:w16se="http://schemas.microsoft.com/office/word/2015/wordml/symex" xmlns:wpg="http://schemas.microsoft.com/office/word/2010/wordprocessingGroup" xmlns:wpi="http://schemas.microsoft.com/office/word/2010/wordprocessingInk" xmlns:wne="http://schemas.microsoft.com/office/word/2006/wordml" xmlns:wps="http://schemas.microsoft.com/office/word/2010/wordprocessingShape" mc:Ignorable="w14 w15 w16se w16cid w16 w16cex w16sdtdh w16sdtfl w16du wp14">
   <w:body>
     <w:p>
-      <w:pPr>
-        <w:rPr>
-          <w:lang w:val="en-US"/>
-        </w:rPr>
-      </w:pPr>
       <w:r>
-        <w:rPr>
-          <w:lang w:val="en-US"/>
-        </w:rPr>
-        <w:t>Logboek met uren vertegenwordiging</w:t>
+        <w:t xml:space="preserve">Logboek met uren </w:t>
+      </w:r>
+      <w:r>
+        <w:t>vertegenwoordiging</w:t>
       </w:r>
     </w:p>
     <w:tbl>
       <w:tblPr>
-        <w:tblStyle w:val="Tabelraster"/>
+        <w:tblStyle w:val="ListTable4-Accent1"/>
         <w:tblW w:w="0" w:type="auto"/>
         <w:tblLook w:val="04A0" w:firstRow="1" w:lastRow="0" w:firstColumn="1" w:lastColumn="0" w:noHBand="0" w:noVBand="1"/>
       </w:tblPr>
@@ -30,22 +25,16 @@
       </w:tblGrid>
       <w:tr>
         <w:trPr>
+          <w:cnfStyle w:val="100000000000" w:firstRow="1" w:lastRow="0" w:firstColumn="0" w:lastColumn="0" w:oddVBand="0" w:evenVBand="0" w:oddHBand="0" w:evenHBand="0" w:firstRowFirstColumn="0" w:firstRowLastColumn="0" w:lastRowFirstColumn="0" w:lastRowLastColumn="0"/>
           <w:trHeight w:val="157"/>
         </w:trPr>
         <w:tc>
           <w:tcPr>
+            <w:cnfStyle w:val="001000000000" w:firstRow="0" w:lastRow="0" w:firstColumn="1" w:lastColumn="0" w:oddVBand="0" w:evenVBand="0" w:oddHBand="0" w:evenHBand="0" w:firstRowFirstColumn="0" w:firstRowLastColumn="0" w:lastRowFirstColumn="0" w:lastRowLastColumn="0"/>
             <w:tcW w:w="1733" w:type="dxa"/>
           </w:tcPr>
           <w:p>
-            <w:pPr>
-              <w:rPr>
-                <w:lang w:val="en-US"/>
-              </w:rPr>
-            </w:pPr>
-            <w:r>
-              <w:rPr>
-                <w:lang w:val="en-US"/>
-              </w:rPr>
+            <w:r>
               <w:t>datum</w:t>
             </w:r>
           </w:p>
@@ -56,14 +45,9 @@
           </w:tcPr>
           <w:p>
             <w:pPr>
-              <w:rPr>
-                <w:lang w:val="en-US"/>
-              </w:rPr>
-            </w:pPr>
-            <w:r>
-              <w:rPr>
-                <w:lang w:val="en-US"/>
-              </w:rPr>
+              <w:cnfStyle w:val="100000000000" w:firstRow="1" w:lastRow="0" w:firstColumn="0" w:lastColumn="0" w:oddVBand="0" w:evenVBand="0" w:oddHBand="0" w:evenHBand="0" w:firstRowFirstColumn="0" w:firstRowLastColumn="0" w:lastRowFirstColumn="0" w:lastRowLastColumn="0"/>
+            </w:pPr>
+            <w:r>
               <w:t>werktijd</w:t>
             </w:r>
           </w:p>
@@ -74,14 +58,9 @@
           </w:tcPr>
           <w:p>
             <w:pPr>
-              <w:rPr>
-                <w:lang w:val="en-US"/>
-              </w:rPr>
-            </w:pPr>
-            <w:r>
-              <w:rPr>
-                <w:lang w:val="en-US"/>
-              </w:rPr>
+              <w:cnfStyle w:val="100000000000" w:firstRow="1" w:lastRow="0" w:firstColumn="0" w:lastColumn="0" w:oddVBand="0" w:evenVBand="0" w:oddHBand="0" w:evenHBand="0" w:firstRowFirstColumn="0" w:firstRowLastColumn="0" w:lastRowFirstColumn="0" w:lastRowLastColumn="0"/>
+            </w:pPr>
+            <w:r>
               <w:t>reistijd</w:t>
             </w:r>
           </w:p>
@@ -92,14 +71,9 @@
           </w:tcPr>
           <w:p>
             <w:pPr>
-              <w:rPr>
-                <w:lang w:val="en-US"/>
-              </w:rPr>
-            </w:pPr>
-            <w:r>
-              <w:rPr>
-                <w:lang w:val="en-US"/>
-              </w:rPr>
+              <w:cnfStyle w:val="100000000000" w:firstRow="1" w:lastRow="0" w:firstColumn="0" w:lastColumn="0" w:oddVBand="0" w:evenVBand="0" w:oddHBand="0" w:evenHBand="0" w:firstRowFirstColumn="0" w:firstRowLastColumn="0" w:lastRowFirstColumn="0" w:lastRowLastColumn="0"/>
+            </w:pPr>
+            <w:r>
               <w:t>Totaal tijd</w:t>
             </w:r>
           </w:p>
@@ -110,14 +84,9 @@
           </w:tcPr>
           <w:p>
             <w:pPr>
-              <w:rPr>
-                <w:lang w:val="en-US"/>
-              </w:rPr>
-            </w:pPr>
-            <w:r>
-              <w:rPr>
-                <w:lang w:val="en-US"/>
-              </w:rPr>
+              <w:cnfStyle w:val="100000000000" w:firstRow="1" w:lastRow="0" w:firstColumn="0" w:lastColumn="0" w:oddVBand="0" w:evenVBand="0" w:oddHBand="0" w:evenHBand="0" w:firstRowFirstColumn="0" w:firstRowLastColumn="0" w:lastRowFirstColumn="0" w:lastRowLastColumn="0"/>
+            </w:pPr>
+            <w:r>
               <w:t>gedaan</w:t>
             </w:r>
           </w:p>
@@ -125,22 +94,16 @@
       </w:tr>
       <w:tr>
         <w:trPr>
+          <w:cnfStyle w:val="000000100000" w:firstRow="0" w:lastRow="0" w:firstColumn="0" w:lastColumn="0" w:oddVBand="0" w:evenVBand="0" w:oddHBand="1" w:evenHBand="0" w:firstRowFirstColumn="0" w:firstRowLastColumn="0" w:lastRowFirstColumn="0" w:lastRowLastColumn="0"/>
           <w:trHeight w:val="157"/>
         </w:trPr>
         <w:tc>
           <w:tcPr>
+            <w:cnfStyle w:val="001000000000" w:firstRow="0" w:lastRow="0" w:firstColumn="1" w:lastColumn="0" w:oddVBand="0" w:evenVBand="0" w:oddHBand="0" w:evenHBand="0" w:firstRowFirstColumn="0" w:firstRowLastColumn="0" w:lastRowFirstColumn="0" w:lastRowLastColumn="0"/>
             <w:tcW w:w="1733" w:type="dxa"/>
           </w:tcPr>
           <w:p>
-            <w:pPr>
-              <w:rPr>
-                <w:lang w:val="en-US"/>
-              </w:rPr>
-            </w:pPr>
-            <w:r>
-              <w:rPr>
-                <w:lang w:val="en-US"/>
-              </w:rPr>
+            <w:r>
               <w:t>10/2</w:t>
             </w:r>
           </w:p>
@@ -151,14 +114,9 @@
           </w:tcPr>
           <w:p>
             <w:pPr>
-              <w:rPr>
-                <w:lang w:val="en-US"/>
-              </w:rPr>
-            </w:pPr>
-            <w:r>
-              <w:rPr>
-                <w:lang w:val="en-US"/>
-              </w:rPr>
+              <w:cnfStyle w:val="000000100000" w:firstRow="0" w:lastRow="0" w:firstColumn="0" w:lastColumn="0" w:oddVBand="0" w:evenVBand="0" w:oddHBand="1" w:evenHBand="0" w:firstRowFirstColumn="0" w:firstRowLastColumn="0" w:lastRowFirstColumn="0" w:lastRowLastColumn="0"/>
+            </w:pPr>
+            <w:r>
               <w:t>1:30</w:t>
             </w:r>
           </w:p>
@@ -169,9 +127,7 @@
           </w:tcPr>
           <w:p>
             <w:pPr>
-              <w:rPr>
-                <w:lang w:val="en-US"/>
-              </w:rPr>
+              <w:cnfStyle w:val="000000100000" w:firstRow="0" w:lastRow="0" w:firstColumn="0" w:lastColumn="0" w:oddVBand="0" w:evenVBand="0" w:oddHBand="1" w:evenHBand="0" w:firstRowFirstColumn="0" w:firstRowLastColumn="0" w:lastRowFirstColumn="0" w:lastRowLastColumn="0"/>
             </w:pPr>
           </w:p>
         </w:tc>
@@ -181,14 +137,9 @@
           </w:tcPr>
           <w:p>
             <w:pPr>
-              <w:rPr>
-                <w:lang w:val="en-US"/>
-              </w:rPr>
-            </w:pPr>
-            <w:r>
-              <w:rPr>
-                <w:lang w:val="en-US"/>
-              </w:rPr>
+              <w:cnfStyle w:val="000000100000" w:firstRow="0" w:lastRow="0" w:firstColumn="0" w:lastColumn="0" w:oddVBand="0" w:evenVBand="0" w:oddHBand="1" w:evenHBand="0" w:firstRowFirstColumn="0" w:firstRowLastColumn="0" w:lastRowFirstColumn="0" w:lastRowLastColumn="0"/>
+            </w:pPr>
+            <w:r>
               <w:t>1:30</w:t>
             </w:r>
           </w:p>
@@ -199,14 +150,9 @@
           </w:tcPr>
           <w:p>
             <w:pPr>
-              <w:rPr>
-                <w:lang w:val="en-US"/>
-              </w:rPr>
-            </w:pPr>
-            <w:r>
-              <w:rPr>
-                <w:lang w:val="en-US"/>
-              </w:rPr>
+              <w:cnfStyle w:val="000000100000" w:firstRow="0" w:lastRow="0" w:firstColumn="0" w:lastColumn="0" w:oddVBand="0" w:evenVBand="0" w:oddHBand="1" w:evenHBand="0" w:firstRowFirstColumn="0" w:firstRowLastColumn="0" w:lastRowFirstColumn="0" w:lastRowLastColumn="0"/>
+            </w:pPr>
+            <w:r>
               <w:t>Kick of op project</w:t>
             </w:r>
           </w:p>
@@ -215,18 +161,11 @@
       <w:tr>
         <w:tc>
           <w:tcPr>
+            <w:cnfStyle w:val="001000000000" w:firstRow="0" w:lastRow="0" w:firstColumn="1" w:lastColumn="0" w:oddVBand="0" w:evenVBand="0" w:oddHBand="0" w:evenHBand="0" w:firstRowFirstColumn="0" w:firstRowLastColumn="0" w:lastRowFirstColumn="0" w:lastRowLastColumn="0"/>
             <w:tcW w:w="1733" w:type="dxa"/>
           </w:tcPr>
           <w:p>
-            <w:pPr>
-              <w:rPr>
-                <w:lang w:val="en-US"/>
-              </w:rPr>
-            </w:pPr>
-            <w:r>
-              <w:rPr>
-                <w:lang w:val="en-US"/>
-              </w:rPr>
+            <w:r>
               <w:t>12/2</w:t>
             </w:r>
           </w:p>
@@ -237,14 +176,9 @@
           </w:tcPr>
           <w:p>
             <w:pPr>
-              <w:rPr>
-                <w:lang w:val="en-US"/>
-              </w:rPr>
-            </w:pPr>
-            <w:r>
-              <w:rPr>
-                <w:lang w:val="en-US"/>
-              </w:rPr>
+              <w:cnfStyle w:val="000000000000" w:firstRow="0" w:lastRow="0" w:firstColumn="0" w:lastColumn="0" w:oddVBand="0" w:evenVBand="0" w:oddHBand="0" w:evenHBand="0" w:firstRowFirstColumn="0" w:firstRowLastColumn="0" w:lastRowFirstColumn="0" w:lastRowLastColumn="0"/>
+            </w:pPr>
+            <w:r>
               <w:t>5</w:t>
             </w:r>
           </w:p>
@@ -255,14 +189,9 @@
           </w:tcPr>
           <w:p>
             <w:pPr>
-              <w:rPr>
-                <w:lang w:val="en-US"/>
-              </w:rPr>
-            </w:pPr>
-            <w:r>
-              <w:rPr>
-                <w:lang w:val="en-US"/>
-              </w:rPr>
+              <w:cnfStyle w:val="000000000000" w:firstRow="0" w:lastRow="0" w:firstColumn="0" w:lastColumn="0" w:oddVBand="0" w:evenVBand="0" w:oddHBand="0" w:evenHBand="0" w:firstRowFirstColumn="0" w:firstRowLastColumn="0" w:lastRowFirstColumn="0" w:lastRowLastColumn="0"/>
+            </w:pPr>
+            <w:r>
               <w:t>3:30</w:t>
             </w:r>
           </w:p>
@@ -273,14 +202,9 @@
           </w:tcPr>
           <w:p>
             <w:pPr>
-              <w:rPr>
-                <w:lang w:val="en-US"/>
-              </w:rPr>
-            </w:pPr>
-            <w:r>
-              <w:rPr>
-                <w:lang w:val="en-US"/>
-              </w:rPr>
+              <w:cnfStyle w:val="000000000000" w:firstRow="0" w:lastRow="0" w:firstColumn="0" w:lastColumn="0" w:oddVBand="0" w:evenVBand="0" w:oddHBand="0" w:evenHBand="0" w:firstRowFirstColumn="0" w:firstRowLastColumn="0" w:lastRowFirstColumn="0" w:lastRowLastColumn="0"/>
+            </w:pPr>
+            <w:r>
               <w:t>8:30</w:t>
             </w:r>
           </w:p>
@@ -291,34 +215,25 @@
           </w:tcPr>
           <w:p>
             <w:pPr>
-              <w:rPr>
-                <w:lang w:val="en-US"/>
-              </w:rPr>
-            </w:pPr>
-            <w:r>
-              <w:rPr>
-                <w:lang w:val="en-US"/>
-              </w:rPr>
+              <w:cnfStyle w:val="000000000000" w:firstRow="0" w:lastRow="0" w:firstColumn="0" w:lastColumn="0" w:oddVBand="0" w:evenVBand="0" w:oddHBand="0" w:evenHBand="0" w:firstRowFirstColumn="0" w:firstRowLastColumn="0" w:lastRowFirstColumn="0" w:lastRowLastColumn="0"/>
+            </w:pPr>
+            <w:r>
               <w:t>Kick of op locatie</w:t>
             </w:r>
           </w:p>
         </w:tc>
       </w:tr>
       <w:tr>
-        <w:tc>
-          <w:tcPr>
+        <w:trPr>
+          <w:cnfStyle w:val="000000100000" w:firstRow="0" w:lastRow="0" w:firstColumn="0" w:lastColumn="0" w:oddVBand="0" w:evenVBand="0" w:oddHBand="1" w:evenHBand="0" w:firstRowFirstColumn="0" w:firstRowLastColumn="0" w:lastRowFirstColumn="0" w:lastRowLastColumn="0"/>
+        </w:trPr>
+        <w:tc>
+          <w:tcPr>
+            <w:cnfStyle w:val="001000000000" w:firstRow="0" w:lastRow="0" w:firstColumn="1" w:lastColumn="0" w:oddVBand="0" w:evenVBand="0" w:oddHBand="0" w:evenHBand="0" w:firstRowFirstColumn="0" w:firstRowLastColumn="0" w:lastRowFirstColumn="0" w:lastRowLastColumn="0"/>
             <w:tcW w:w="1733" w:type="dxa"/>
           </w:tcPr>
           <w:p>
-            <w:pPr>
-              <w:rPr>
-                <w:lang w:val="en-US"/>
-              </w:rPr>
-            </w:pPr>
-            <w:r>
-              <w:rPr>
-                <w:lang w:val="en-US"/>
-              </w:rPr>
+            <w:r>
               <w:t>13/2</w:t>
             </w:r>
           </w:p>
@@ -329,14 +244,9 @@
           </w:tcPr>
           <w:p>
             <w:pPr>
-              <w:rPr>
-                <w:lang w:val="en-US"/>
-              </w:rPr>
-            </w:pPr>
-            <w:r>
-              <w:rPr>
-                <w:lang w:val="en-US"/>
-              </w:rPr>
+              <w:cnfStyle w:val="000000100000" w:firstRow="0" w:lastRow="0" w:firstColumn="0" w:lastColumn="0" w:oddVBand="0" w:evenVBand="0" w:oddHBand="1" w:evenHBand="0" w:firstRowFirstColumn="0" w:firstRowLastColumn="0" w:lastRowFirstColumn="0" w:lastRowLastColumn="0"/>
+            </w:pPr>
+            <w:r>
               <w:t>6</w:t>
             </w:r>
           </w:p>
@@ -347,14 +257,9 @@
           </w:tcPr>
           <w:p>
             <w:pPr>
-              <w:rPr>
-                <w:lang w:val="en-US"/>
-              </w:rPr>
-            </w:pPr>
-            <w:r>
-              <w:rPr>
-                <w:lang w:val="en-US"/>
-              </w:rPr>
+              <w:cnfStyle w:val="000000100000" w:firstRow="0" w:lastRow="0" w:firstColumn="0" w:lastColumn="0" w:oddVBand="0" w:evenVBand="0" w:oddHBand="1" w:evenHBand="0" w:firstRowFirstColumn="0" w:firstRowLastColumn="0" w:lastRowFirstColumn="0" w:lastRowLastColumn="0"/>
+            </w:pPr>
+            <w:r>
               <w:t>0</w:t>
             </w:r>
           </w:p>
@@ -365,14 +270,9 @@
           </w:tcPr>
           <w:p>
             <w:pPr>
-              <w:rPr>
-                <w:lang w:val="en-US"/>
-              </w:rPr>
-            </w:pPr>
-            <w:r>
-              <w:rPr>
-                <w:lang w:val="en-US"/>
-              </w:rPr>
+              <w:cnfStyle w:val="000000100000" w:firstRow="0" w:lastRow="0" w:firstColumn="0" w:lastColumn="0" w:oddVBand="0" w:evenVBand="0" w:oddHBand="1" w:evenHBand="0" w:firstRowFirstColumn="0" w:firstRowLastColumn="0" w:lastRowFirstColumn="0" w:lastRowLastColumn="0"/>
+            </w:pPr>
+            <w:r>
               <w:t>6</w:t>
             </w:r>
           </w:p>
@@ -383,34 +283,35 @@
           </w:tcPr>
           <w:p>
             <w:pPr>
-              <w:rPr>
-                <w:lang w:val="en-US"/>
-              </w:rPr>
-            </w:pPr>
-            <w:r>
-              <w:rPr>
-                <w:lang w:val="en-US"/>
-              </w:rPr>
-              <w:t>Workshop + voorblad maken + begin requirements + userstories</w:t>
-            </w:r>
+              <w:cnfStyle w:val="000000100000" w:firstRow="0" w:lastRow="0" w:firstColumn="0" w:lastColumn="0" w:oddVBand="0" w:evenVBand="0" w:oddHBand="1" w:evenHBand="0" w:firstRowFirstColumn="0" w:firstRowLastColumn="0" w:lastRowFirstColumn="0" w:lastRowLastColumn="0"/>
+            </w:pPr>
+            <w:r>
+              <w:t xml:space="preserve">Workshop + voorblad maken + begin </w:t>
+            </w:r>
+            <w:proofErr w:type="spellStart"/>
+            <w:r>
+              <w:t>requirements</w:t>
+            </w:r>
+            <w:proofErr w:type="spellEnd"/>
+            <w:r>
+              <w:t xml:space="preserve"> + </w:t>
+            </w:r>
+            <w:proofErr w:type="spellStart"/>
+            <w:r>
+              <w:t>userstories</w:t>
+            </w:r>
+            <w:proofErr w:type="spellEnd"/>
           </w:p>
         </w:tc>
       </w:tr>
       <w:tr>
         <w:tc>
           <w:tcPr>
+            <w:cnfStyle w:val="001000000000" w:firstRow="0" w:lastRow="0" w:firstColumn="1" w:lastColumn="0" w:oddVBand="0" w:evenVBand="0" w:oddHBand="0" w:evenHBand="0" w:firstRowFirstColumn="0" w:firstRowLastColumn="0" w:lastRowFirstColumn="0" w:lastRowLastColumn="0"/>
             <w:tcW w:w="1733" w:type="dxa"/>
           </w:tcPr>
           <w:p>
-            <w:pPr>
-              <w:rPr>
-                <w:lang w:val="en-US"/>
-              </w:rPr>
-            </w:pPr>
-            <w:r>
-              <w:rPr>
-                <w:lang w:val="en-US"/>
-              </w:rPr>
+            <w:r>
               <w:t>15/2</w:t>
             </w:r>
           </w:p>
@@ -421,14 +322,9 @@
           </w:tcPr>
           <w:p>
             <w:pPr>
-              <w:rPr>
-                <w:lang w:val="en-US"/>
-              </w:rPr>
-            </w:pPr>
-            <w:r>
-              <w:rPr>
-                <w:lang w:val="en-US"/>
-              </w:rPr>
+              <w:cnfStyle w:val="000000000000" w:firstRow="0" w:lastRow="0" w:firstColumn="0" w:lastColumn="0" w:oddVBand="0" w:evenVBand="0" w:oddHBand="0" w:evenHBand="0" w:firstRowFirstColumn="0" w:firstRowLastColumn="0" w:lastRowFirstColumn="0" w:lastRowLastColumn="0"/>
+            </w:pPr>
+            <w:r>
               <w:t>20 minuten</w:t>
             </w:r>
           </w:p>
@@ -439,14 +335,9 @@
           </w:tcPr>
           <w:p>
             <w:pPr>
-              <w:rPr>
-                <w:lang w:val="en-US"/>
-              </w:rPr>
-            </w:pPr>
-            <w:r>
-              <w:rPr>
-                <w:lang w:val="en-US"/>
-              </w:rPr>
+              <w:cnfStyle w:val="000000000000" w:firstRow="0" w:lastRow="0" w:firstColumn="0" w:lastColumn="0" w:oddVBand="0" w:evenVBand="0" w:oddHBand="0" w:evenHBand="0" w:firstRowFirstColumn="0" w:firstRowLastColumn="0" w:lastRowFirstColumn="0" w:lastRowLastColumn="0"/>
+            </w:pPr>
+            <w:r>
               <w:t>0</w:t>
             </w:r>
           </w:p>
@@ -457,14 +348,9 @@
           </w:tcPr>
           <w:p>
             <w:pPr>
-              <w:rPr>
-                <w:lang w:val="en-US"/>
-              </w:rPr>
-            </w:pPr>
-            <w:r>
-              <w:rPr>
-                <w:lang w:val="en-US"/>
-              </w:rPr>
+              <w:cnfStyle w:val="000000000000" w:firstRow="0" w:lastRow="0" w:firstColumn="0" w:lastColumn="0" w:oddVBand="0" w:evenVBand="0" w:oddHBand="0" w:evenHBand="0" w:firstRowFirstColumn="0" w:firstRowLastColumn="0" w:lastRowFirstColumn="0" w:lastRowLastColumn="0"/>
+            </w:pPr>
+            <w:r>
               <w:t>0:20</w:t>
             </w:r>
           </w:p>
@@ -475,30 +361,35 @@
           </w:tcPr>
           <w:p>
             <w:pPr>
-              <w:rPr>
-                <w:lang w:val="en-US"/>
-              </w:rPr>
-            </w:pPr>
-            <w:r>
-              <w:rPr>
-                <w:lang w:val="en-US"/>
-              </w:rPr>
-              <w:t>Feedback gegeven op userstories.</w:t>
+              <w:cnfStyle w:val="000000000000" w:firstRow="0" w:lastRow="0" w:firstColumn="0" w:lastColumn="0" w:oddVBand="0" w:evenVBand="0" w:oddHBand="0" w:evenHBand="0" w:firstRowFirstColumn="0" w:firstRowLastColumn="0" w:lastRowFirstColumn="0" w:lastRowLastColumn="0"/>
+            </w:pPr>
+            <w:r>
+              <w:t xml:space="preserve">Feedback gegeven op </w:t>
+            </w:r>
+            <w:proofErr w:type="spellStart"/>
+            <w:r>
+              <w:t>userstories</w:t>
+            </w:r>
+            <w:proofErr w:type="spellEnd"/>
+            <w:r>
+              <w:t>.</w:t>
             </w:r>
           </w:p>
         </w:tc>
       </w:tr>
       <w:tr>
-        <w:tc>
-          <w:tcPr>
+        <w:trPr>
+          <w:cnfStyle w:val="000000100000" w:firstRow="0" w:lastRow="0" w:firstColumn="0" w:lastColumn="0" w:oddVBand="0" w:evenVBand="0" w:oddHBand="1" w:evenHBand="0" w:firstRowFirstColumn="0" w:firstRowLastColumn="0" w:lastRowFirstColumn="0" w:lastRowLastColumn="0"/>
+        </w:trPr>
+        <w:tc>
+          <w:tcPr>
+            <w:cnfStyle w:val="001000000000" w:firstRow="0" w:lastRow="0" w:firstColumn="1" w:lastColumn="0" w:oddVBand="0" w:evenVBand="0" w:oddHBand="0" w:evenHBand="0" w:firstRowFirstColumn="0" w:firstRowLastColumn="0" w:lastRowFirstColumn="0" w:lastRowLastColumn="0"/>
             <w:tcW w:w="1733" w:type="dxa"/>
           </w:tcPr>
           <w:p>
-            <w:pPr>
-              <w:rPr>
-                <w:lang w:val="en-US"/>
-              </w:rPr>
-            </w:pPr>
+            <w:r>
+              <w:t>19/2</w:t>
+            </w:r>
           </w:p>
         </w:tc>
         <w:tc>
@@ -507,10 +398,11 @@
           </w:tcPr>
           <w:p>
             <w:pPr>
-              <w:rPr>
-                <w:lang w:val="en-US"/>
-              </w:rPr>
-            </w:pPr>
+              <w:cnfStyle w:val="000000100000" w:firstRow="0" w:lastRow="0" w:firstColumn="0" w:lastColumn="0" w:oddVBand="0" w:evenVBand="0" w:oddHBand="1" w:evenHBand="0" w:firstRowFirstColumn="0" w:firstRowLastColumn="0" w:lastRowFirstColumn="0" w:lastRowLastColumn="0"/>
+            </w:pPr>
+            <w:r>
+              <w:t>5</w:t>
+            </w:r>
           </w:p>
         </w:tc>
         <w:tc>
@@ -519,10 +411,11 @@
           </w:tcPr>
           <w:p>
             <w:pPr>
-              <w:rPr>
-                <w:lang w:val="en-US"/>
-              </w:rPr>
-            </w:pPr>
+              <w:cnfStyle w:val="000000100000" w:firstRow="0" w:lastRow="0" w:firstColumn="0" w:lastColumn="0" w:oddVBand="0" w:evenVBand="0" w:oddHBand="1" w:evenHBand="0" w:firstRowFirstColumn="0" w:firstRowLastColumn="0" w:lastRowFirstColumn="0" w:lastRowLastColumn="0"/>
+            </w:pPr>
+            <w:r>
+              <w:t>3:30</w:t>
+            </w:r>
           </w:p>
         </w:tc>
         <w:tc>
@@ -531,10 +424,11 @@
           </w:tcPr>
           <w:p>
             <w:pPr>
-              <w:rPr>
-                <w:lang w:val="en-US"/>
-              </w:rPr>
-            </w:pPr>
+              <w:cnfStyle w:val="000000100000" w:firstRow="0" w:lastRow="0" w:firstColumn="0" w:lastColumn="0" w:oddVBand="0" w:evenVBand="0" w:oddHBand="1" w:evenHBand="0" w:firstRowFirstColumn="0" w:firstRowLastColumn="0" w:lastRowFirstColumn="0" w:lastRowLastColumn="0"/>
+            </w:pPr>
+            <w:r>
+              <w:t>8:30</w:t>
+            </w:r>
           </w:p>
         </w:tc>
         <w:tc>
@@ -543,21 +437,551 @@
           </w:tcPr>
           <w:p>
             <w:pPr>
-              <w:rPr>
-                <w:lang w:val="en-US"/>
-              </w:rPr>
+              <w:cnfStyle w:val="000000100000" w:firstRow="0" w:lastRow="0" w:firstColumn="0" w:lastColumn="0" w:oddVBand="0" w:evenVBand="0" w:oddHBand="1" w:evenHBand="0" w:firstRowFirstColumn="0" w:firstRowLastColumn="0" w:lastRowFirstColumn="0" w:lastRowLastColumn="0"/>
+            </w:pPr>
+          </w:p>
+        </w:tc>
+      </w:tr>
+      <w:tr>
+        <w:tc>
+          <w:tcPr>
+            <w:cnfStyle w:val="001000000000" w:firstRow="0" w:lastRow="0" w:firstColumn="1" w:lastColumn="0" w:oddVBand="0" w:evenVBand="0" w:oddHBand="0" w:evenHBand="0" w:firstRowFirstColumn="0" w:firstRowLastColumn="0" w:lastRowFirstColumn="0" w:lastRowLastColumn="0"/>
+            <w:tcW w:w="1733" w:type="dxa"/>
+          </w:tcPr>
+          <w:p>
+            <w:r>
+              <w:t>24/2</w:t>
+            </w:r>
+          </w:p>
+        </w:tc>
+        <w:tc>
+          <w:tcPr>
+            <w:tcW w:w="1827" w:type="dxa"/>
+          </w:tcPr>
+          <w:p>
+            <w:pPr>
+              <w:cnfStyle w:val="000000000000" w:firstRow="0" w:lastRow="0" w:firstColumn="0" w:lastColumn="0" w:oddVBand="0" w:evenVBand="0" w:oddHBand="0" w:evenHBand="0" w:firstRowFirstColumn="0" w:firstRowLastColumn="0" w:lastRowFirstColumn="0" w:lastRowLastColumn="0"/>
+            </w:pPr>
+            <w:r>
+              <w:t>4</w:t>
+            </w:r>
+          </w:p>
+        </w:tc>
+        <w:tc>
+          <w:tcPr>
+            <w:tcW w:w="1647" w:type="dxa"/>
+          </w:tcPr>
+          <w:p>
+            <w:pPr>
+              <w:cnfStyle w:val="000000000000" w:firstRow="0" w:lastRow="0" w:firstColumn="0" w:lastColumn="0" w:oddVBand="0" w:evenVBand="0" w:oddHBand="0" w:evenHBand="0" w:firstRowFirstColumn="0" w:firstRowLastColumn="0" w:lastRowFirstColumn="0" w:lastRowLastColumn="0"/>
+            </w:pPr>
+            <w:r>
+              <w:t>0</w:t>
+            </w:r>
+          </w:p>
+        </w:tc>
+        <w:tc>
+          <w:tcPr>
+            <w:tcW w:w="1707" w:type="dxa"/>
+          </w:tcPr>
+          <w:p>
+            <w:pPr>
+              <w:cnfStyle w:val="000000000000" w:firstRow="0" w:lastRow="0" w:firstColumn="0" w:lastColumn="0" w:oddVBand="0" w:evenVBand="0" w:oddHBand="0" w:evenHBand="0" w:firstRowFirstColumn="0" w:firstRowLastColumn="0" w:lastRowFirstColumn="0" w:lastRowLastColumn="0"/>
+            </w:pPr>
+            <w:r>
+              <w:t>4</w:t>
+            </w:r>
+          </w:p>
+        </w:tc>
+        <w:tc>
+          <w:tcPr>
+            <w:tcW w:w="2148" w:type="dxa"/>
+          </w:tcPr>
+          <w:p>
+            <w:pPr>
+              <w:cnfStyle w:val="000000000000" w:firstRow="0" w:lastRow="0" w:firstColumn="0" w:lastColumn="0" w:oddVBand="0" w:evenVBand="0" w:oddHBand="0" w:evenHBand="0" w:firstRowFirstColumn="0" w:firstRowLastColumn="0" w:lastRowFirstColumn="0" w:lastRowLastColumn="0"/>
+            </w:pPr>
+            <w:r>
+              <w:t>Presentatie voorbereiden en geven</w:t>
+            </w:r>
+          </w:p>
+        </w:tc>
+      </w:tr>
+      <w:tr>
+        <w:trPr>
+          <w:cnfStyle w:val="000000100000" w:firstRow="0" w:lastRow="0" w:firstColumn="0" w:lastColumn="0" w:oddVBand="0" w:evenVBand="0" w:oddHBand="1" w:evenHBand="0" w:firstRowFirstColumn="0" w:firstRowLastColumn="0" w:lastRowFirstColumn="0" w:lastRowLastColumn="0"/>
+        </w:trPr>
+        <w:tc>
+          <w:tcPr>
+            <w:cnfStyle w:val="001000000000" w:firstRow="0" w:lastRow="0" w:firstColumn="1" w:lastColumn="0" w:oddVBand="0" w:evenVBand="0" w:oddHBand="0" w:evenHBand="0" w:firstRowFirstColumn="0" w:firstRowLastColumn="0" w:lastRowFirstColumn="0" w:lastRowLastColumn="0"/>
+            <w:tcW w:w="1733" w:type="dxa"/>
+          </w:tcPr>
+          <w:p>
+            <w:r>
+              <w:t>26/2</w:t>
+            </w:r>
+          </w:p>
+        </w:tc>
+        <w:tc>
+          <w:tcPr>
+            <w:tcW w:w="1827" w:type="dxa"/>
+          </w:tcPr>
+          <w:p>
+            <w:pPr>
+              <w:cnfStyle w:val="000000100000" w:firstRow="0" w:lastRow="0" w:firstColumn="0" w:lastColumn="0" w:oddVBand="0" w:evenVBand="0" w:oddHBand="1" w:evenHBand="0" w:firstRowFirstColumn="0" w:firstRowLastColumn="0" w:lastRowFirstColumn="0" w:lastRowLastColumn="0"/>
+            </w:pPr>
+            <w:r>
+              <w:t>5</w:t>
+            </w:r>
+          </w:p>
+        </w:tc>
+        <w:tc>
+          <w:tcPr>
+            <w:tcW w:w="1647" w:type="dxa"/>
+          </w:tcPr>
+          <w:p>
+            <w:pPr>
+              <w:cnfStyle w:val="000000100000" w:firstRow="0" w:lastRow="0" w:firstColumn="0" w:lastColumn="0" w:oddVBand="0" w:evenVBand="0" w:oddHBand="1" w:evenHBand="0" w:firstRowFirstColumn="0" w:firstRowLastColumn="0" w:lastRowFirstColumn="0" w:lastRowLastColumn="0"/>
+            </w:pPr>
+            <w:r>
+              <w:t>2:45</w:t>
+            </w:r>
+          </w:p>
+        </w:tc>
+        <w:tc>
+          <w:tcPr>
+            <w:tcW w:w="1707" w:type="dxa"/>
+          </w:tcPr>
+          <w:p>
+            <w:pPr>
+              <w:cnfStyle w:val="000000100000" w:firstRow="0" w:lastRow="0" w:firstColumn="0" w:lastColumn="0" w:oddVBand="0" w:evenVBand="0" w:oddHBand="1" w:evenHBand="0" w:firstRowFirstColumn="0" w:firstRowLastColumn="0" w:lastRowFirstColumn="0" w:lastRowLastColumn="0"/>
+            </w:pPr>
+            <w:r>
+              <w:t>7:45</w:t>
+            </w:r>
+          </w:p>
+        </w:tc>
+        <w:tc>
+          <w:tcPr>
+            <w:tcW w:w="2148" w:type="dxa"/>
+          </w:tcPr>
+          <w:p>
+            <w:pPr>
+              <w:cnfStyle w:val="000000100000" w:firstRow="0" w:lastRow="0" w:firstColumn="0" w:lastColumn="0" w:oddVBand="0" w:evenVBand="0" w:oddHBand="1" w:evenHBand="0" w:firstRowFirstColumn="0" w:firstRowLastColumn="0" w:lastRowFirstColumn="0" w:lastRowLastColumn="0"/>
+            </w:pPr>
+            <w:r>
+              <w:t xml:space="preserve">Test beelden gemaakt op het </w:t>
+            </w:r>
+            <w:proofErr w:type="spellStart"/>
+            <w:r>
+              <w:t>rdw</w:t>
+            </w:r>
+            <w:proofErr w:type="spellEnd"/>
+          </w:p>
+        </w:tc>
+      </w:tr>
+      <w:tr>
+        <w:tc>
+          <w:tcPr>
+            <w:cnfStyle w:val="001000000000" w:firstRow="0" w:lastRow="0" w:firstColumn="1" w:lastColumn="0" w:oddVBand="0" w:evenVBand="0" w:oddHBand="0" w:evenHBand="0" w:firstRowFirstColumn="0" w:firstRowLastColumn="0" w:lastRowFirstColumn="0" w:lastRowLastColumn="0"/>
+            <w:tcW w:w="1733" w:type="dxa"/>
+          </w:tcPr>
+          <w:p>
+            <w:r>
+              <w:t>27/2</w:t>
+            </w:r>
+          </w:p>
+        </w:tc>
+        <w:tc>
+          <w:tcPr>
+            <w:tcW w:w="1827" w:type="dxa"/>
+          </w:tcPr>
+          <w:p>
+            <w:pPr>
+              <w:cnfStyle w:val="000000000000" w:firstRow="0" w:lastRow="0" w:firstColumn="0" w:lastColumn="0" w:oddVBand="0" w:evenVBand="0" w:oddHBand="0" w:evenHBand="0" w:firstRowFirstColumn="0" w:firstRowLastColumn="0" w:lastRowFirstColumn="0" w:lastRowLastColumn="0"/>
+            </w:pPr>
+            <w:r>
+              <w:t>8</w:t>
+            </w:r>
+          </w:p>
+        </w:tc>
+        <w:tc>
+          <w:tcPr>
+            <w:tcW w:w="1647" w:type="dxa"/>
+          </w:tcPr>
+          <w:p>
+            <w:pPr>
+              <w:cnfStyle w:val="000000000000" w:firstRow="0" w:lastRow="0" w:firstColumn="0" w:lastColumn="0" w:oddVBand="0" w:evenVBand="0" w:oddHBand="0" w:evenHBand="0" w:firstRowFirstColumn="0" w:firstRowLastColumn="0" w:lastRowFirstColumn="0" w:lastRowLastColumn="0"/>
+            </w:pPr>
+            <w:r>
+              <w:t>0</w:t>
+            </w:r>
+          </w:p>
+        </w:tc>
+        <w:tc>
+          <w:tcPr>
+            <w:tcW w:w="1707" w:type="dxa"/>
+          </w:tcPr>
+          <w:p>
+            <w:pPr>
+              <w:cnfStyle w:val="000000000000" w:firstRow="0" w:lastRow="0" w:firstColumn="0" w:lastColumn="0" w:oddVBand="0" w:evenVBand="0" w:oddHBand="0" w:evenHBand="0" w:firstRowFirstColumn="0" w:firstRowLastColumn="0" w:lastRowFirstColumn="0" w:lastRowLastColumn="0"/>
+            </w:pPr>
+            <w:r>
+              <w:t>8</w:t>
+            </w:r>
+          </w:p>
+        </w:tc>
+        <w:tc>
+          <w:tcPr>
+            <w:tcW w:w="2148" w:type="dxa"/>
+          </w:tcPr>
+          <w:p>
+            <w:pPr>
+              <w:cnfStyle w:val="000000000000" w:firstRow="0" w:lastRow="0" w:firstColumn="0" w:lastColumn="0" w:oddVBand="0" w:evenVBand="0" w:oddHBand="0" w:evenHBand="0" w:firstRowFirstColumn="0" w:firstRowLastColumn="0" w:lastRowFirstColumn="0" w:lastRowLastColumn="0"/>
+            </w:pPr>
+            <w:r>
+              <w:t xml:space="preserve">Linux op laptop zetten en aan </w:t>
+            </w:r>
+            <w:proofErr w:type="spellStart"/>
+            <w:r>
+              <w:t>samenwerkings</w:t>
+            </w:r>
+            <w:proofErr w:type="spellEnd"/>
+            <w:r>
+              <w:t xml:space="preserve"> </w:t>
+            </w:r>
+            <w:proofErr w:type="spellStart"/>
+            <w:r>
+              <w:t>overeeenkomst</w:t>
+            </w:r>
+            <w:proofErr w:type="spellEnd"/>
+            <w:r>
+              <w:t xml:space="preserve"> gewerkt</w:t>
+            </w:r>
+          </w:p>
+        </w:tc>
+      </w:tr>
+      <w:tr>
+        <w:trPr>
+          <w:cnfStyle w:val="000000100000" w:firstRow="0" w:lastRow="0" w:firstColumn="0" w:lastColumn="0" w:oddVBand="0" w:evenVBand="0" w:oddHBand="1" w:evenHBand="0" w:firstRowFirstColumn="0" w:firstRowLastColumn="0" w:lastRowFirstColumn="0" w:lastRowLastColumn="0"/>
+        </w:trPr>
+        <w:tc>
+          <w:tcPr>
+            <w:cnfStyle w:val="001000000000" w:firstRow="0" w:lastRow="0" w:firstColumn="1" w:lastColumn="0" w:oddVBand="0" w:evenVBand="0" w:oddHBand="0" w:evenHBand="0" w:firstRowFirstColumn="0" w:firstRowLastColumn="0" w:lastRowFirstColumn="0" w:lastRowLastColumn="0"/>
+            <w:tcW w:w="1733" w:type="dxa"/>
+          </w:tcPr>
+          <w:p>
+            <w:r>
+              <w:t>3/3</w:t>
+            </w:r>
+          </w:p>
+        </w:tc>
+        <w:tc>
+          <w:tcPr>
+            <w:tcW w:w="1827" w:type="dxa"/>
+          </w:tcPr>
+          <w:p>
+            <w:pPr>
+              <w:cnfStyle w:val="000000100000" w:firstRow="0" w:lastRow="0" w:firstColumn="0" w:lastColumn="0" w:oddVBand="0" w:evenVBand="0" w:oddHBand="1" w:evenHBand="0" w:firstRowFirstColumn="0" w:firstRowLastColumn="0" w:lastRowFirstColumn="0" w:lastRowLastColumn="0"/>
+            </w:pPr>
+            <w:r>
+              <w:t>4</w:t>
+            </w:r>
+          </w:p>
+        </w:tc>
+        <w:tc>
+          <w:tcPr>
+            <w:tcW w:w="1647" w:type="dxa"/>
+          </w:tcPr>
+          <w:p>
+            <w:pPr>
+              <w:cnfStyle w:val="000000100000" w:firstRow="0" w:lastRow="0" w:firstColumn="0" w:lastColumn="0" w:oddVBand="0" w:evenVBand="0" w:oddHBand="1" w:evenHBand="0" w:firstRowFirstColumn="0" w:firstRowLastColumn="0" w:lastRowFirstColumn="0" w:lastRowLastColumn="0"/>
+            </w:pPr>
+            <w:r>
+              <w:t>0</w:t>
+            </w:r>
+          </w:p>
+        </w:tc>
+        <w:tc>
+          <w:tcPr>
+            <w:tcW w:w="1707" w:type="dxa"/>
+          </w:tcPr>
+          <w:p>
+            <w:pPr>
+              <w:cnfStyle w:val="000000100000" w:firstRow="0" w:lastRow="0" w:firstColumn="0" w:lastColumn="0" w:oddVBand="0" w:evenVBand="0" w:oddHBand="1" w:evenHBand="0" w:firstRowFirstColumn="0" w:firstRowLastColumn="0" w:lastRowFirstColumn="0" w:lastRowLastColumn="0"/>
+            </w:pPr>
+            <w:r>
+              <w:t>4</w:t>
+            </w:r>
+          </w:p>
+        </w:tc>
+        <w:tc>
+          <w:tcPr>
+            <w:tcW w:w="2148" w:type="dxa"/>
+          </w:tcPr>
+          <w:p>
+            <w:pPr>
+              <w:cnfStyle w:val="000000100000" w:firstRow="0" w:lastRow="0" w:firstColumn="0" w:lastColumn="0" w:oddVBand="0" w:evenVBand="0" w:oddHBand="1" w:evenHBand="0" w:firstRowFirstColumn="0" w:firstRowLastColumn="0" w:lastRowFirstColumn="0" w:lastRowLastColumn="0"/>
+            </w:pPr>
+            <w:r>
+              <w:t>Presentatie voorbereiden en geven</w:t>
+            </w:r>
+          </w:p>
+        </w:tc>
+      </w:tr>
+      <w:tr>
+        <w:tc>
+          <w:tcPr>
+            <w:cnfStyle w:val="001000000000" w:firstRow="0" w:lastRow="0" w:firstColumn="1" w:lastColumn="0" w:oddVBand="0" w:evenVBand="0" w:oddHBand="0" w:evenHBand="0" w:firstRowFirstColumn="0" w:firstRowLastColumn="0" w:lastRowFirstColumn="0" w:lastRowLastColumn="0"/>
+            <w:tcW w:w="1733" w:type="dxa"/>
+          </w:tcPr>
+          <w:p>
+            <w:r>
+              <w:t>5/3</w:t>
+            </w:r>
+          </w:p>
+        </w:tc>
+        <w:tc>
+          <w:tcPr>
+            <w:tcW w:w="1827" w:type="dxa"/>
+          </w:tcPr>
+          <w:p>
+            <w:pPr>
+              <w:cnfStyle w:val="000000000000" w:firstRow="0" w:lastRow="0" w:firstColumn="0" w:lastColumn="0" w:oddVBand="0" w:evenVBand="0" w:oddHBand="0" w:evenHBand="0" w:firstRowFirstColumn="0" w:firstRowLastColumn="0" w:lastRowFirstColumn="0" w:lastRowLastColumn="0"/>
+            </w:pPr>
+            <w:r>
+              <w:t>5</w:t>
+            </w:r>
+          </w:p>
+        </w:tc>
+        <w:tc>
+          <w:tcPr>
+            <w:tcW w:w="1647" w:type="dxa"/>
+          </w:tcPr>
+          <w:p>
+            <w:pPr>
+              <w:cnfStyle w:val="000000000000" w:firstRow="0" w:lastRow="0" w:firstColumn="0" w:lastColumn="0" w:oddVBand="0" w:evenVBand="0" w:oddHBand="0" w:evenHBand="0" w:firstRowFirstColumn="0" w:firstRowLastColumn="0" w:lastRowFirstColumn="0" w:lastRowLastColumn="0"/>
+            </w:pPr>
+            <w:r>
+              <w:t>0</w:t>
+            </w:r>
+          </w:p>
+        </w:tc>
+        <w:tc>
+          <w:tcPr>
+            <w:tcW w:w="1707" w:type="dxa"/>
+          </w:tcPr>
+          <w:p>
+            <w:pPr>
+              <w:cnfStyle w:val="000000000000" w:firstRow="0" w:lastRow="0" w:firstColumn="0" w:lastColumn="0" w:oddVBand="0" w:evenVBand="0" w:oddHBand="0" w:evenHBand="0" w:firstRowFirstColumn="0" w:firstRowLastColumn="0" w:lastRowFirstColumn="0" w:lastRowLastColumn="0"/>
+            </w:pPr>
+            <w:r>
+              <w:t>5</w:t>
+            </w:r>
+          </w:p>
+        </w:tc>
+        <w:tc>
+          <w:tcPr>
+            <w:tcW w:w="2148" w:type="dxa"/>
+          </w:tcPr>
+          <w:p>
+            <w:pPr>
+              <w:cnfStyle w:val="000000000000" w:firstRow="0" w:lastRow="0" w:firstColumn="0" w:lastColumn="0" w:oddVBand="0" w:evenVBand="0" w:oddHBand="0" w:evenHBand="0" w:firstRowFirstColumn="0" w:firstRowLastColumn="0" w:lastRowFirstColumn="0" w:lastRowLastColumn="0"/>
+            </w:pPr>
+            <w:proofErr w:type="spellStart"/>
+            <w:r>
+              <w:t>Onderzoeks</w:t>
+            </w:r>
+            <w:proofErr w:type="spellEnd"/>
+            <w:r>
+              <w:t xml:space="preserve"> verslag camera resolutie en frame </w:t>
+            </w:r>
+            <w:proofErr w:type="spellStart"/>
+            <w:r>
+              <w:t>rate</w:t>
+            </w:r>
+            <w:proofErr w:type="spellEnd"/>
+          </w:p>
+        </w:tc>
+      </w:tr>
+      <w:tr>
+        <w:trPr>
+          <w:cnfStyle w:val="000000100000" w:firstRow="0" w:lastRow="0" w:firstColumn="0" w:lastColumn="0" w:oddVBand="0" w:evenVBand="0" w:oddHBand="1" w:evenHBand="0" w:firstRowFirstColumn="0" w:firstRowLastColumn="0" w:lastRowFirstColumn="0" w:lastRowLastColumn="0"/>
+        </w:trPr>
+        <w:tc>
+          <w:tcPr>
+            <w:cnfStyle w:val="001000000000" w:firstRow="0" w:lastRow="0" w:firstColumn="1" w:lastColumn="0" w:oddVBand="0" w:evenVBand="0" w:oddHBand="0" w:evenHBand="0" w:firstRowFirstColumn="0" w:firstRowLastColumn="0" w:lastRowFirstColumn="0" w:lastRowLastColumn="0"/>
+            <w:tcW w:w="1733" w:type="dxa"/>
+          </w:tcPr>
+          <w:p>
+            <w:r>
+              <w:t>10/3</w:t>
+            </w:r>
+          </w:p>
+        </w:tc>
+        <w:tc>
+          <w:tcPr>
+            <w:tcW w:w="1827" w:type="dxa"/>
+          </w:tcPr>
+          <w:p>
+            <w:pPr>
+              <w:cnfStyle w:val="000000100000" w:firstRow="0" w:lastRow="0" w:firstColumn="0" w:lastColumn="0" w:oddVBand="0" w:evenVBand="0" w:oddHBand="1" w:evenHBand="0" w:firstRowFirstColumn="0" w:firstRowLastColumn="0" w:lastRowFirstColumn="0" w:lastRowLastColumn="0"/>
+            </w:pPr>
+            <w:r>
+              <w:t>6</w:t>
+            </w:r>
+          </w:p>
+        </w:tc>
+        <w:tc>
+          <w:tcPr>
+            <w:tcW w:w="1647" w:type="dxa"/>
+          </w:tcPr>
+          <w:p>
+            <w:pPr>
+              <w:cnfStyle w:val="000000100000" w:firstRow="0" w:lastRow="0" w:firstColumn="0" w:lastColumn="0" w:oddVBand="0" w:evenVBand="0" w:oddHBand="1" w:evenHBand="0" w:firstRowFirstColumn="0" w:firstRowLastColumn="0" w:lastRowFirstColumn="0" w:lastRowLastColumn="0"/>
+            </w:pPr>
+            <w:r>
+              <w:t>0</w:t>
+            </w:r>
+          </w:p>
+        </w:tc>
+        <w:tc>
+          <w:tcPr>
+            <w:tcW w:w="1707" w:type="dxa"/>
+          </w:tcPr>
+          <w:p>
+            <w:pPr>
+              <w:cnfStyle w:val="000000100000" w:firstRow="0" w:lastRow="0" w:firstColumn="0" w:lastColumn="0" w:oddVBand="0" w:evenVBand="0" w:oddHBand="1" w:evenHBand="0" w:firstRowFirstColumn="0" w:firstRowLastColumn="0" w:lastRowFirstColumn="0" w:lastRowLastColumn="0"/>
+            </w:pPr>
+          </w:p>
+        </w:tc>
+        <w:tc>
+          <w:tcPr>
+            <w:tcW w:w="2148" w:type="dxa"/>
+          </w:tcPr>
+          <w:p>
+            <w:pPr>
+              <w:cnfStyle w:val="000000100000" w:firstRow="0" w:lastRow="0" w:firstColumn="0" w:lastColumn="0" w:oddVBand="0" w:evenVBand="0" w:oddHBand="1" w:evenHBand="0" w:firstRowFirstColumn="0" w:firstRowLastColumn="0" w:lastRowFirstColumn="0" w:lastRowLastColumn="0"/>
+            </w:pPr>
+          </w:p>
+        </w:tc>
+      </w:tr>
+      <w:tr>
+        <w:tc>
+          <w:tcPr>
+            <w:cnfStyle w:val="001000000000" w:firstRow="0" w:lastRow="0" w:firstColumn="1" w:lastColumn="0" w:oddVBand="0" w:evenVBand="0" w:oddHBand="0" w:evenHBand="0" w:firstRowFirstColumn="0" w:firstRowLastColumn="0" w:lastRowFirstColumn="0" w:lastRowLastColumn="0"/>
+            <w:tcW w:w="1733" w:type="dxa"/>
+          </w:tcPr>
+          <w:p/>
+        </w:tc>
+        <w:tc>
+          <w:tcPr>
+            <w:tcW w:w="1827" w:type="dxa"/>
+          </w:tcPr>
+          <w:p>
+            <w:pPr>
+              <w:cnfStyle w:val="000000000000" w:firstRow="0" w:lastRow="0" w:firstColumn="0" w:lastColumn="0" w:oddVBand="0" w:evenVBand="0" w:oddHBand="0" w:evenHBand="0" w:firstRowFirstColumn="0" w:firstRowLastColumn="0" w:lastRowFirstColumn="0" w:lastRowLastColumn="0"/>
+            </w:pPr>
+          </w:p>
+        </w:tc>
+        <w:tc>
+          <w:tcPr>
+            <w:tcW w:w="1647" w:type="dxa"/>
+          </w:tcPr>
+          <w:p>
+            <w:pPr>
+              <w:cnfStyle w:val="000000000000" w:firstRow="0" w:lastRow="0" w:firstColumn="0" w:lastColumn="0" w:oddVBand="0" w:evenVBand="0" w:oddHBand="0" w:evenHBand="0" w:firstRowFirstColumn="0" w:firstRowLastColumn="0" w:lastRowFirstColumn="0" w:lastRowLastColumn="0"/>
+            </w:pPr>
+          </w:p>
+        </w:tc>
+        <w:tc>
+          <w:tcPr>
+            <w:tcW w:w="1707" w:type="dxa"/>
+          </w:tcPr>
+          <w:p>
+            <w:pPr>
+              <w:cnfStyle w:val="000000000000" w:firstRow="0" w:lastRow="0" w:firstColumn="0" w:lastColumn="0" w:oddVBand="0" w:evenVBand="0" w:oddHBand="0" w:evenHBand="0" w:firstRowFirstColumn="0" w:firstRowLastColumn="0" w:lastRowFirstColumn="0" w:lastRowLastColumn="0"/>
+            </w:pPr>
+          </w:p>
+        </w:tc>
+        <w:tc>
+          <w:tcPr>
+            <w:tcW w:w="2148" w:type="dxa"/>
+          </w:tcPr>
+          <w:p>
+            <w:pPr>
+              <w:cnfStyle w:val="000000000000" w:firstRow="0" w:lastRow="0" w:firstColumn="0" w:lastColumn="0" w:oddVBand="0" w:evenVBand="0" w:oddHBand="0" w:evenHBand="0" w:firstRowFirstColumn="0" w:firstRowLastColumn="0" w:lastRowFirstColumn="0" w:lastRowLastColumn="0"/>
+            </w:pPr>
+          </w:p>
+        </w:tc>
+      </w:tr>
+      <w:tr>
+        <w:trPr>
+          <w:cnfStyle w:val="000000100000" w:firstRow="0" w:lastRow="0" w:firstColumn="0" w:lastColumn="0" w:oddVBand="0" w:evenVBand="0" w:oddHBand="1" w:evenHBand="0" w:firstRowFirstColumn="0" w:firstRowLastColumn="0" w:lastRowFirstColumn="0" w:lastRowLastColumn="0"/>
+        </w:trPr>
+        <w:tc>
+          <w:tcPr>
+            <w:cnfStyle w:val="001000000000" w:firstRow="0" w:lastRow="0" w:firstColumn="1" w:lastColumn="0" w:oddVBand="0" w:evenVBand="0" w:oddHBand="0" w:evenHBand="0" w:firstRowFirstColumn="0" w:firstRowLastColumn="0" w:lastRowFirstColumn="0" w:lastRowLastColumn="0"/>
+            <w:tcW w:w="1733" w:type="dxa"/>
+          </w:tcPr>
+          <w:p>
+            <w:r>
+              <w:t xml:space="preserve">Totalen tijd: </w:t>
+            </w:r>
+          </w:p>
+        </w:tc>
+        <w:tc>
+          <w:tcPr>
+            <w:tcW w:w="1827" w:type="dxa"/>
+          </w:tcPr>
+          <w:p>
+            <w:pPr>
+              <w:cnfStyle w:val="000000100000" w:firstRow="0" w:lastRow="0" w:firstColumn="0" w:lastColumn="0" w:oddVBand="0" w:evenVBand="0" w:oddHBand="1" w:evenHBand="0" w:firstRowFirstColumn="0" w:firstRowLastColumn="0" w:lastRowFirstColumn="0" w:lastRowLastColumn="0"/>
+            </w:pPr>
+            <w:r>
+              <w:t>43:50</w:t>
+            </w:r>
+          </w:p>
+        </w:tc>
+        <w:tc>
+          <w:tcPr>
+            <w:tcW w:w="1647" w:type="dxa"/>
+          </w:tcPr>
+          <w:p>
+            <w:pPr>
+              <w:cnfStyle w:val="000000100000" w:firstRow="0" w:lastRow="0" w:firstColumn="0" w:lastColumn="0" w:oddVBand="0" w:evenVBand="0" w:oddHBand="1" w:evenHBand="0" w:firstRowFirstColumn="0" w:firstRowLastColumn="0" w:lastRowFirstColumn="0" w:lastRowLastColumn="0"/>
+            </w:pPr>
+            <w:r>
+              <w:t>9:45</w:t>
+            </w:r>
+          </w:p>
+        </w:tc>
+        <w:tc>
+          <w:tcPr>
+            <w:tcW w:w="1707" w:type="dxa"/>
+          </w:tcPr>
+          <w:p>
+            <w:pPr>
+              <w:cnfStyle w:val="000000100000" w:firstRow="0" w:lastRow="0" w:firstColumn="0" w:lastColumn="0" w:oddVBand="0" w:evenVBand="0" w:oddHBand="1" w:evenHBand="0" w:firstRowFirstColumn="0" w:firstRowLastColumn="0" w:lastRowFirstColumn="0" w:lastRowLastColumn="0"/>
+            </w:pPr>
+            <w:r>
+              <w:t>53:35</w:t>
+            </w:r>
+          </w:p>
+        </w:tc>
+        <w:tc>
+          <w:tcPr>
+            <w:tcW w:w="2148" w:type="dxa"/>
+          </w:tcPr>
+          <w:p>
+            <w:pPr>
+              <w:cnfStyle w:val="000000100000" w:firstRow="0" w:lastRow="0" w:firstColumn="0" w:lastColumn="0" w:oddVBand="0" w:evenVBand="0" w:oddHBand="1" w:evenHBand="0" w:firstRowFirstColumn="0" w:firstRowLastColumn="0" w:lastRowFirstColumn="0" w:lastRowLastColumn="0"/>
             </w:pPr>
           </w:p>
         </w:tc>
       </w:tr>
     </w:tbl>
-    <w:p>
-      <w:pPr>
-        <w:rPr>
-          <w:lang w:val="en-US"/>
-        </w:rPr>
-      </w:pPr>
-    </w:p>
+    <w:p/>
     <w:sectPr>
       <w:pgSz w:w="11906" w:h="16838"/>
       <w:pgMar w:top="1417" w:right="1417" w:bottom="1417" w:left="1417" w:header="708" w:footer="708" w:gutter="0"/>
@@ -965,15 +1389,15 @@
     <w:lsdException w:name="Unresolved Mention" w:semiHidden="1" w:unhideWhenUsed="1"/>
     <w:lsdException w:name="Smart Link" w:semiHidden="1" w:unhideWhenUsed="1"/>
   </w:latentStyles>
-  <w:style w:type="paragraph" w:default="1" w:styleId="Standaard">
+  <w:style w:type="paragraph" w:default="1" w:styleId="Normal">
     <w:name w:val="Normal"/>
     <w:qFormat/>
   </w:style>
-  <w:style w:type="paragraph" w:styleId="Kop1">
+  <w:style w:type="paragraph" w:styleId="Heading1">
     <w:name w:val="heading 1"/>
-    <w:basedOn w:val="Standaard"/>
-    <w:next w:val="Standaard"/>
-    <w:link w:val="Kop1Char"/>
+    <w:basedOn w:val="Normal"/>
+    <w:next w:val="Normal"/>
+    <w:link w:val="Heading1Char"/>
     <w:uiPriority w:val="9"/>
     <w:qFormat/>
     <w:rsid w:val="006A4DD6"/>
@@ -985,16 +1409,16 @@
     </w:pPr>
     <w:rPr>
       <w:rFonts w:asciiTheme="majorHAnsi" w:eastAsiaTheme="majorEastAsia" w:hAnsiTheme="majorHAnsi" w:cstheme="majorBidi"/>
-      <w:color w:val="0F4761" w:themeColor="accent1" w:themeShade="BF"/>
+      <w:color w:val="864EA8" w:themeColor="accent1" w:themeShade="BF"/>
       <w:sz w:val="40"/>
       <w:szCs w:val="40"/>
     </w:rPr>
   </w:style>
-  <w:style w:type="paragraph" w:styleId="Kop2">
+  <w:style w:type="paragraph" w:styleId="Heading2">
     <w:name w:val="heading 2"/>
-    <w:basedOn w:val="Standaard"/>
-    <w:next w:val="Standaard"/>
-    <w:link w:val="Kop2Char"/>
+    <w:basedOn w:val="Normal"/>
+    <w:next w:val="Normal"/>
+    <w:link w:val="Heading2Char"/>
     <w:uiPriority w:val="9"/>
     <w:semiHidden/>
     <w:unhideWhenUsed/>
@@ -1008,16 +1432,16 @@
     </w:pPr>
     <w:rPr>
       <w:rFonts w:asciiTheme="majorHAnsi" w:eastAsiaTheme="majorEastAsia" w:hAnsiTheme="majorHAnsi" w:cstheme="majorBidi"/>
-      <w:color w:val="0F4761" w:themeColor="accent1" w:themeShade="BF"/>
+      <w:color w:val="864EA8" w:themeColor="accent1" w:themeShade="BF"/>
       <w:sz w:val="32"/>
       <w:szCs w:val="32"/>
     </w:rPr>
   </w:style>
-  <w:style w:type="paragraph" w:styleId="Kop3">
+  <w:style w:type="paragraph" w:styleId="Heading3">
     <w:name w:val="heading 3"/>
-    <w:basedOn w:val="Standaard"/>
-    <w:next w:val="Standaard"/>
-    <w:link w:val="Kop3Char"/>
+    <w:basedOn w:val="Normal"/>
+    <w:next w:val="Normal"/>
+    <w:link w:val="Heading3Char"/>
     <w:uiPriority w:val="9"/>
     <w:semiHidden/>
     <w:unhideWhenUsed/>
@@ -1031,16 +1455,16 @@
     </w:pPr>
     <w:rPr>
       <w:rFonts w:eastAsiaTheme="majorEastAsia" w:cstheme="majorBidi"/>
-      <w:color w:val="0F4761" w:themeColor="accent1" w:themeShade="BF"/>
+      <w:color w:val="864EA8" w:themeColor="accent1" w:themeShade="BF"/>
       <w:sz w:val="28"/>
       <w:szCs w:val="28"/>
     </w:rPr>
   </w:style>
-  <w:style w:type="paragraph" w:styleId="Kop4">
+  <w:style w:type="paragraph" w:styleId="Heading4">
     <w:name w:val="heading 4"/>
-    <w:basedOn w:val="Standaard"/>
-    <w:next w:val="Standaard"/>
-    <w:link w:val="Kop4Char"/>
+    <w:basedOn w:val="Normal"/>
+    <w:next w:val="Normal"/>
+    <w:link w:val="Heading4Char"/>
     <w:uiPriority w:val="9"/>
     <w:semiHidden/>
     <w:unhideWhenUsed/>
@@ -1056,14 +1480,14 @@
       <w:rFonts w:eastAsiaTheme="majorEastAsia" w:cstheme="majorBidi"/>
       <w:i/>
       <w:iCs/>
-      <w:color w:val="0F4761" w:themeColor="accent1" w:themeShade="BF"/>
-    </w:rPr>
-  </w:style>
-  <w:style w:type="paragraph" w:styleId="Kop5">
+      <w:color w:val="864EA8" w:themeColor="accent1" w:themeShade="BF"/>
+    </w:rPr>
+  </w:style>
+  <w:style w:type="paragraph" w:styleId="Heading5">
     <w:name w:val="heading 5"/>
-    <w:basedOn w:val="Standaard"/>
-    <w:next w:val="Standaard"/>
-    <w:link w:val="Kop5Char"/>
+    <w:basedOn w:val="Normal"/>
+    <w:next w:val="Normal"/>
+    <w:link w:val="Heading5Char"/>
     <w:uiPriority w:val="9"/>
     <w:semiHidden/>
     <w:unhideWhenUsed/>
@@ -1077,14 +1501,14 @@
     </w:pPr>
     <w:rPr>
       <w:rFonts w:eastAsiaTheme="majorEastAsia" w:cstheme="majorBidi"/>
-      <w:color w:val="0F4761" w:themeColor="accent1" w:themeShade="BF"/>
-    </w:rPr>
-  </w:style>
-  <w:style w:type="paragraph" w:styleId="Kop6">
+      <w:color w:val="864EA8" w:themeColor="accent1" w:themeShade="BF"/>
+    </w:rPr>
+  </w:style>
+  <w:style w:type="paragraph" w:styleId="Heading6">
     <w:name w:val="heading 6"/>
-    <w:basedOn w:val="Standaard"/>
-    <w:next w:val="Standaard"/>
-    <w:link w:val="Kop6Char"/>
+    <w:basedOn w:val="Normal"/>
+    <w:next w:val="Normal"/>
+    <w:link w:val="Heading6Char"/>
     <w:uiPriority w:val="9"/>
     <w:semiHidden/>
     <w:unhideWhenUsed/>
@@ -1103,11 +1527,11 @@
       <w:color w:val="595959" w:themeColor="text1" w:themeTint="A6"/>
     </w:rPr>
   </w:style>
-  <w:style w:type="paragraph" w:styleId="Kop7">
+  <w:style w:type="paragraph" w:styleId="Heading7">
     <w:name w:val="heading 7"/>
-    <w:basedOn w:val="Standaard"/>
-    <w:next w:val="Standaard"/>
-    <w:link w:val="Kop7Char"/>
+    <w:basedOn w:val="Normal"/>
+    <w:next w:val="Normal"/>
+    <w:link w:val="Heading7Char"/>
     <w:uiPriority w:val="9"/>
     <w:semiHidden/>
     <w:unhideWhenUsed/>
@@ -1124,11 +1548,11 @@
       <w:color w:val="595959" w:themeColor="text1" w:themeTint="A6"/>
     </w:rPr>
   </w:style>
-  <w:style w:type="paragraph" w:styleId="Kop8">
+  <w:style w:type="paragraph" w:styleId="Heading8">
     <w:name w:val="heading 8"/>
-    <w:basedOn w:val="Standaard"/>
-    <w:next w:val="Standaard"/>
-    <w:link w:val="Kop8Char"/>
+    <w:basedOn w:val="Normal"/>
+    <w:next w:val="Normal"/>
+    <w:link w:val="Heading8Char"/>
     <w:uiPriority w:val="9"/>
     <w:semiHidden/>
     <w:unhideWhenUsed/>
@@ -1147,11 +1571,11 @@
       <w:color w:val="272727" w:themeColor="text1" w:themeTint="D8"/>
     </w:rPr>
   </w:style>
-  <w:style w:type="paragraph" w:styleId="Kop9">
+  <w:style w:type="paragraph" w:styleId="Heading9">
     <w:name w:val="heading 9"/>
-    <w:basedOn w:val="Standaard"/>
-    <w:next w:val="Standaard"/>
-    <w:link w:val="Kop9Char"/>
+    <w:basedOn w:val="Normal"/>
+    <w:next w:val="Normal"/>
+    <w:link w:val="Heading9Char"/>
     <w:uiPriority w:val="9"/>
     <w:semiHidden/>
     <w:unhideWhenUsed/>
@@ -1168,13 +1592,13 @@
       <w:color w:val="272727" w:themeColor="text1" w:themeTint="D8"/>
     </w:rPr>
   </w:style>
-  <w:style w:type="character" w:default="1" w:styleId="Standaardalinea-lettertype">
+  <w:style w:type="character" w:default="1" w:styleId="DefaultParagraphFont">
     <w:name w:val="Default Paragraph Font"/>
     <w:uiPriority w:val="1"/>
     <w:semiHidden/>
     <w:unhideWhenUsed/>
   </w:style>
-  <w:style w:type="table" w:default="1" w:styleId="Standaardtabel">
+  <w:style w:type="table" w:default="1" w:styleId="TableNormal">
     <w:name w:val="Normal Table"/>
     <w:uiPriority w:val="99"/>
     <w:semiHidden/>
@@ -1189,57 +1613,57 @@
       </w:tblCellMar>
     </w:tblPr>
   </w:style>
-  <w:style w:type="numbering" w:default="1" w:styleId="Geenlijst">
+  <w:style w:type="numbering" w:default="1" w:styleId="NoList">
     <w:name w:val="No List"/>
     <w:uiPriority w:val="99"/>
     <w:semiHidden/>
     <w:unhideWhenUsed/>
   </w:style>
-  <w:style w:type="character" w:customStyle="1" w:styleId="Kop1Char">
-    <w:name w:val="Kop 1 Char"/>
-    <w:basedOn w:val="Standaardalinea-lettertype"/>
-    <w:link w:val="Kop1"/>
+  <w:style w:type="character" w:customStyle="1" w:styleId="Heading1Char">
+    <w:name w:val="Heading 1 Char"/>
+    <w:basedOn w:val="DefaultParagraphFont"/>
+    <w:link w:val="Heading1"/>
     <w:uiPriority w:val="9"/>
     <w:rsid w:val="006A4DD6"/>
     <w:rPr>
       <w:rFonts w:asciiTheme="majorHAnsi" w:eastAsiaTheme="majorEastAsia" w:hAnsiTheme="majorHAnsi" w:cstheme="majorBidi"/>
-      <w:color w:val="0F4761" w:themeColor="accent1" w:themeShade="BF"/>
+      <w:color w:val="864EA8" w:themeColor="accent1" w:themeShade="BF"/>
       <w:sz w:val="40"/>
       <w:szCs w:val="40"/>
     </w:rPr>
   </w:style>
-  <w:style w:type="character" w:customStyle="1" w:styleId="Kop2Char">
-    <w:name w:val="Kop 2 Char"/>
-    <w:basedOn w:val="Standaardalinea-lettertype"/>
-    <w:link w:val="Kop2"/>
+  <w:style w:type="character" w:customStyle="1" w:styleId="Heading2Char">
+    <w:name w:val="Heading 2 Char"/>
+    <w:basedOn w:val="DefaultParagraphFont"/>
+    <w:link w:val="Heading2"/>
     <w:uiPriority w:val="9"/>
     <w:semiHidden/>
     <w:rsid w:val="006A4DD6"/>
     <w:rPr>
       <w:rFonts w:asciiTheme="majorHAnsi" w:eastAsiaTheme="majorEastAsia" w:hAnsiTheme="majorHAnsi" w:cstheme="majorBidi"/>
-      <w:color w:val="0F4761" w:themeColor="accent1" w:themeShade="BF"/>
+      <w:color w:val="864EA8" w:themeColor="accent1" w:themeShade="BF"/>
       <w:sz w:val="32"/>
       <w:szCs w:val="32"/>
     </w:rPr>
   </w:style>
-  <w:style w:type="character" w:customStyle="1" w:styleId="Kop3Char">
-    <w:name w:val="Kop 3 Char"/>
-    <w:basedOn w:val="Standaardalinea-lettertype"/>
-    <w:link w:val="Kop3"/>
+  <w:style w:type="character" w:customStyle="1" w:styleId="Heading3Char">
+    <w:name w:val="Heading 3 Char"/>
+    <w:basedOn w:val="DefaultParagraphFont"/>
+    <w:link w:val="Heading3"/>
     <w:uiPriority w:val="9"/>
     <w:semiHidden/>
     <w:rsid w:val="006A4DD6"/>
     <w:rPr>
       <w:rFonts w:eastAsiaTheme="majorEastAsia" w:cstheme="majorBidi"/>
-      <w:color w:val="0F4761" w:themeColor="accent1" w:themeShade="BF"/>
+      <w:color w:val="864EA8" w:themeColor="accent1" w:themeShade="BF"/>
       <w:sz w:val="28"/>
       <w:szCs w:val="28"/>
     </w:rPr>
   </w:style>
-  <w:style w:type="character" w:customStyle="1" w:styleId="Kop4Char">
-    <w:name w:val="Kop 4 Char"/>
-    <w:basedOn w:val="Standaardalinea-lettertype"/>
-    <w:link w:val="Kop4"/>
+  <w:style w:type="character" w:customStyle="1" w:styleId="Heading4Char">
+    <w:name w:val="Heading 4 Char"/>
+    <w:basedOn w:val="DefaultParagraphFont"/>
+    <w:link w:val="Heading4"/>
     <w:uiPriority w:val="9"/>
     <w:semiHidden/>
     <w:rsid w:val="006A4DD6"/>
@@ -1247,25 +1671,25 @@
       <w:rFonts w:eastAsiaTheme="majorEastAsia" w:cstheme="majorBidi"/>
       <w:i/>
       <w:iCs/>
-      <w:color w:val="0F4761" w:themeColor="accent1" w:themeShade="BF"/>
-    </w:rPr>
-  </w:style>
-  <w:style w:type="character" w:customStyle="1" w:styleId="Kop5Char">
-    <w:name w:val="Kop 5 Char"/>
-    <w:basedOn w:val="Standaardalinea-lettertype"/>
-    <w:link w:val="Kop5"/>
+      <w:color w:val="864EA8" w:themeColor="accent1" w:themeShade="BF"/>
+    </w:rPr>
+  </w:style>
+  <w:style w:type="character" w:customStyle="1" w:styleId="Heading5Char">
+    <w:name w:val="Heading 5 Char"/>
+    <w:basedOn w:val="DefaultParagraphFont"/>
+    <w:link w:val="Heading5"/>
     <w:uiPriority w:val="9"/>
     <w:semiHidden/>
     <w:rsid w:val="006A4DD6"/>
     <w:rPr>
       <w:rFonts w:eastAsiaTheme="majorEastAsia" w:cstheme="majorBidi"/>
-      <w:color w:val="0F4761" w:themeColor="accent1" w:themeShade="BF"/>
-    </w:rPr>
-  </w:style>
-  <w:style w:type="character" w:customStyle="1" w:styleId="Kop6Char">
-    <w:name w:val="Kop 6 Char"/>
-    <w:basedOn w:val="Standaardalinea-lettertype"/>
-    <w:link w:val="Kop6"/>
+      <w:color w:val="864EA8" w:themeColor="accent1" w:themeShade="BF"/>
+    </w:rPr>
+  </w:style>
+  <w:style w:type="character" w:customStyle="1" w:styleId="Heading6Char">
+    <w:name w:val="Heading 6 Char"/>
+    <w:basedOn w:val="DefaultParagraphFont"/>
+    <w:link w:val="Heading6"/>
     <w:uiPriority w:val="9"/>
     <w:semiHidden/>
     <w:rsid w:val="006A4DD6"/>
@@ -1276,10 +1700,10 @@
       <w:color w:val="595959" w:themeColor="text1" w:themeTint="A6"/>
     </w:rPr>
   </w:style>
-  <w:style w:type="character" w:customStyle="1" w:styleId="Kop7Char">
-    <w:name w:val="Kop 7 Char"/>
-    <w:basedOn w:val="Standaardalinea-lettertype"/>
-    <w:link w:val="Kop7"/>
+  <w:style w:type="character" w:customStyle="1" w:styleId="Heading7Char">
+    <w:name w:val="Heading 7 Char"/>
+    <w:basedOn w:val="DefaultParagraphFont"/>
+    <w:link w:val="Heading7"/>
     <w:uiPriority w:val="9"/>
     <w:semiHidden/>
     <w:rsid w:val="006A4DD6"/>
@@ -1288,10 +1712,10 @@
       <w:color w:val="595959" w:themeColor="text1" w:themeTint="A6"/>
     </w:rPr>
   </w:style>
-  <w:style w:type="character" w:customStyle="1" w:styleId="Kop8Char">
-    <w:name w:val="Kop 8 Char"/>
-    <w:basedOn w:val="Standaardalinea-lettertype"/>
-    <w:link w:val="Kop8"/>
+  <w:style w:type="character" w:customStyle="1" w:styleId="Heading8Char">
+    <w:name w:val="Heading 8 Char"/>
+    <w:basedOn w:val="DefaultParagraphFont"/>
+    <w:link w:val="Heading8"/>
     <w:uiPriority w:val="9"/>
     <w:semiHidden/>
     <w:rsid w:val="006A4DD6"/>
@@ -1302,10 +1726,10 @@
       <w:color w:val="272727" w:themeColor="text1" w:themeTint="D8"/>
     </w:rPr>
   </w:style>
-  <w:style w:type="character" w:customStyle="1" w:styleId="Kop9Char">
-    <w:name w:val="Kop 9 Char"/>
-    <w:basedOn w:val="Standaardalinea-lettertype"/>
-    <w:link w:val="Kop9"/>
+  <w:style w:type="character" w:customStyle="1" w:styleId="Heading9Char">
+    <w:name w:val="Heading 9 Char"/>
+    <w:basedOn w:val="DefaultParagraphFont"/>
+    <w:link w:val="Heading9"/>
     <w:uiPriority w:val="9"/>
     <w:semiHidden/>
     <w:rsid w:val="006A4DD6"/>
@@ -1314,11 +1738,11 @@
       <w:color w:val="272727" w:themeColor="text1" w:themeTint="D8"/>
     </w:rPr>
   </w:style>
-  <w:style w:type="paragraph" w:styleId="Titel">
+  <w:style w:type="paragraph" w:styleId="Title">
     <w:name w:val="Title"/>
-    <w:basedOn w:val="Standaard"/>
-    <w:next w:val="Standaard"/>
-    <w:link w:val="TitelChar"/>
+    <w:basedOn w:val="Normal"/>
+    <w:next w:val="Normal"/>
+    <w:link w:val="TitleChar"/>
     <w:uiPriority w:val="10"/>
     <w:qFormat/>
     <w:rsid w:val="006A4DD6"/>
@@ -1334,10 +1758,10 @@
       <w:szCs w:val="56"/>
     </w:rPr>
   </w:style>
-  <w:style w:type="character" w:customStyle="1" w:styleId="TitelChar">
-    <w:name w:val="Titel Char"/>
-    <w:basedOn w:val="Standaardalinea-lettertype"/>
-    <w:link w:val="Titel"/>
+  <w:style w:type="character" w:customStyle="1" w:styleId="TitleChar">
+    <w:name w:val="Title Char"/>
+    <w:basedOn w:val="DefaultParagraphFont"/>
+    <w:link w:val="Title"/>
     <w:uiPriority w:val="10"/>
     <w:rsid w:val="006A4DD6"/>
     <w:rPr>
@@ -1348,11 +1772,11 @@
       <w:szCs w:val="56"/>
     </w:rPr>
   </w:style>
-  <w:style w:type="paragraph" w:styleId="Ondertitel">
+  <w:style w:type="paragraph" w:styleId="Subtitle">
     <w:name w:val="Subtitle"/>
-    <w:basedOn w:val="Standaard"/>
-    <w:next w:val="Standaard"/>
-    <w:link w:val="OndertitelChar"/>
+    <w:basedOn w:val="Normal"/>
+    <w:next w:val="Normal"/>
+    <w:link w:val="SubtitleChar"/>
     <w:uiPriority w:val="11"/>
     <w:qFormat/>
     <w:rsid w:val="006A4DD6"/>
@@ -1369,10 +1793,10 @@
       <w:szCs w:val="28"/>
     </w:rPr>
   </w:style>
-  <w:style w:type="character" w:customStyle="1" w:styleId="OndertitelChar">
-    <w:name w:val="Ondertitel Char"/>
-    <w:basedOn w:val="Standaardalinea-lettertype"/>
-    <w:link w:val="Ondertitel"/>
+  <w:style w:type="character" w:customStyle="1" w:styleId="SubtitleChar">
+    <w:name w:val="Subtitle Char"/>
+    <w:basedOn w:val="DefaultParagraphFont"/>
+    <w:link w:val="Subtitle"/>
     <w:uiPriority w:val="11"/>
     <w:rsid w:val="006A4DD6"/>
     <w:rPr>
@@ -1383,11 +1807,11 @@
       <w:szCs w:val="28"/>
     </w:rPr>
   </w:style>
-  <w:style w:type="paragraph" w:styleId="Citaat">
+  <w:style w:type="paragraph" w:styleId="Quote">
     <w:name w:val="Quote"/>
-    <w:basedOn w:val="Standaard"/>
-    <w:next w:val="Standaard"/>
-    <w:link w:val="CitaatChar"/>
+    <w:basedOn w:val="Normal"/>
+    <w:next w:val="Normal"/>
+    <w:link w:val="QuoteChar"/>
     <w:uiPriority w:val="29"/>
     <w:qFormat/>
     <w:rsid w:val="006A4DD6"/>
@@ -1401,10 +1825,10 @@
       <w:color w:val="404040" w:themeColor="text1" w:themeTint="BF"/>
     </w:rPr>
   </w:style>
-  <w:style w:type="character" w:customStyle="1" w:styleId="CitaatChar">
-    <w:name w:val="Citaat Char"/>
-    <w:basedOn w:val="Standaardalinea-lettertype"/>
-    <w:link w:val="Citaat"/>
+  <w:style w:type="character" w:customStyle="1" w:styleId="QuoteChar">
+    <w:name w:val="Quote Char"/>
+    <w:basedOn w:val="DefaultParagraphFont"/>
+    <w:link w:val="Quote"/>
     <w:uiPriority w:val="29"/>
     <w:rsid w:val="006A4DD6"/>
     <w:rPr>
@@ -1413,9 +1837,9 @@
       <w:color w:val="404040" w:themeColor="text1" w:themeTint="BF"/>
     </w:rPr>
   </w:style>
-  <w:style w:type="paragraph" w:styleId="Lijstalinea">
+  <w:style w:type="paragraph" w:styleId="ListParagraph">
     <w:name w:val="List Paragraph"/>
-    <w:basedOn w:val="Standaard"/>
+    <w:basedOn w:val="Normal"/>
     <w:uiPriority w:val="34"/>
     <w:qFormat/>
     <w:rsid w:val="006A4DD6"/>
@@ -1424,30 +1848,30 @@
       <w:contextualSpacing/>
     </w:pPr>
   </w:style>
-  <w:style w:type="character" w:styleId="Intensievebenadrukking">
+  <w:style w:type="character" w:styleId="IntenseEmphasis">
     <w:name w:val="Intense Emphasis"/>
-    <w:basedOn w:val="Standaardalinea-lettertype"/>
+    <w:basedOn w:val="DefaultParagraphFont"/>
     <w:uiPriority w:val="21"/>
     <w:qFormat/>
     <w:rsid w:val="006A4DD6"/>
     <w:rPr>
       <w:i/>
       <w:iCs/>
-      <w:color w:val="0F4761" w:themeColor="accent1" w:themeShade="BF"/>
-    </w:rPr>
-  </w:style>
-  <w:style w:type="paragraph" w:styleId="Duidelijkcitaat">
+      <w:color w:val="864EA8" w:themeColor="accent1" w:themeShade="BF"/>
+    </w:rPr>
+  </w:style>
+  <w:style w:type="paragraph" w:styleId="IntenseQuote">
     <w:name w:val="Intense Quote"/>
-    <w:basedOn w:val="Standaard"/>
-    <w:next w:val="Standaard"/>
-    <w:link w:val="DuidelijkcitaatChar"/>
+    <w:basedOn w:val="Normal"/>
+    <w:next w:val="Normal"/>
+    <w:link w:val="IntenseQuoteChar"/>
     <w:uiPriority w:val="30"/>
     <w:qFormat/>
     <w:rsid w:val="006A4DD6"/>
     <w:pPr>
       <w:pBdr>
-        <w:top w:val="single" w:sz="4" w:space="10" w:color="0F4761" w:themeColor="accent1" w:themeShade="BF"/>
-        <w:bottom w:val="single" w:sz="4" w:space="10" w:color="0F4761" w:themeColor="accent1" w:themeShade="BF"/>
+        <w:top w:val="single" w:sz="4" w:space="10" w:color="864EA8" w:themeColor="accent1" w:themeShade="BF"/>
+        <w:bottom w:val="single" w:sz="4" w:space="10" w:color="864EA8" w:themeColor="accent1" w:themeShade="BF"/>
       </w:pBdr>
       <w:spacing w:before="360" w:after="360"/>
       <w:ind w:left="864" w:right="864"/>
@@ -1456,24 +1880,24 @@
     <w:rPr>
       <w:i/>
       <w:iCs/>
-      <w:color w:val="0F4761" w:themeColor="accent1" w:themeShade="BF"/>
-    </w:rPr>
-  </w:style>
-  <w:style w:type="character" w:customStyle="1" w:styleId="DuidelijkcitaatChar">
-    <w:name w:val="Duidelijk citaat Char"/>
-    <w:basedOn w:val="Standaardalinea-lettertype"/>
-    <w:link w:val="Duidelijkcitaat"/>
+      <w:color w:val="864EA8" w:themeColor="accent1" w:themeShade="BF"/>
+    </w:rPr>
+  </w:style>
+  <w:style w:type="character" w:customStyle="1" w:styleId="IntenseQuoteChar">
+    <w:name w:val="Intense Quote Char"/>
+    <w:basedOn w:val="DefaultParagraphFont"/>
+    <w:link w:val="IntenseQuote"/>
     <w:uiPriority w:val="30"/>
     <w:rsid w:val="006A4DD6"/>
     <w:rPr>
       <w:i/>
       <w:iCs/>
-      <w:color w:val="0F4761" w:themeColor="accent1" w:themeShade="BF"/>
-    </w:rPr>
-  </w:style>
-  <w:style w:type="character" w:styleId="Intensieveverwijzing">
+      <w:color w:val="864EA8" w:themeColor="accent1" w:themeShade="BF"/>
+    </w:rPr>
+  </w:style>
+  <w:style w:type="character" w:styleId="IntenseReference">
     <w:name w:val="Intense Reference"/>
-    <w:basedOn w:val="Standaardalinea-lettertype"/>
+    <w:basedOn w:val="DefaultParagraphFont"/>
     <w:uiPriority w:val="32"/>
     <w:qFormat/>
     <w:rsid w:val="006A4DD6"/>
@@ -1481,13 +1905,13 @@
       <w:b/>
       <w:bCs/>
       <w:smallCaps/>
-      <w:color w:val="0F4761" w:themeColor="accent1" w:themeShade="BF"/>
+      <w:color w:val="864EA8" w:themeColor="accent1" w:themeShade="BF"/>
       <w:spacing w:val="5"/>
     </w:rPr>
   </w:style>
-  <w:style w:type="table" w:styleId="Tabelraster">
+  <w:style w:type="table" w:styleId="TableGrid">
     <w:name w:val="Table Grid"/>
-    <w:basedOn w:val="Standaardtabel"/>
+    <w:basedOn w:val="TableNormal"/>
     <w:uiPriority w:val="39"/>
     <w:rsid w:val="00551ED4"/>
     <w:pPr>
@@ -1504,13 +1928,87 @@
       </w:tblBorders>
     </w:tblPr>
   </w:style>
+  <w:style w:type="table" w:styleId="ListTable4-Accent1">
+    <w:name w:val="List Table 4 Accent 1"/>
+    <w:basedOn w:val="TableNormal"/>
+    <w:uiPriority w:val="49"/>
+    <w:rsid w:val="00286C9E"/>
+    <w:pPr>
+      <w:spacing w:after="0" w:line="240" w:lineRule="auto"/>
+    </w:pPr>
+    <w:tblPr>
+      <w:tblStyleRowBandSize w:val="1"/>
+      <w:tblStyleColBandSize w:val="1"/>
+      <w:tblBorders>
+        <w:top w:val="single" w:sz="4" w:space="0" w:color="CDB5DC" w:themeColor="accent1" w:themeTint="99"/>
+        <w:left w:val="single" w:sz="4" w:space="0" w:color="CDB5DC" w:themeColor="accent1" w:themeTint="99"/>
+        <w:bottom w:val="single" w:sz="4" w:space="0" w:color="CDB5DC" w:themeColor="accent1" w:themeTint="99"/>
+        <w:right w:val="single" w:sz="4" w:space="0" w:color="CDB5DC" w:themeColor="accent1" w:themeTint="99"/>
+        <w:insideH w:val="single" w:sz="4" w:space="0" w:color="CDB5DC" w:themeColor="accent1" w:themeTint="99"/>
+      </w:tblBorders>
+    </w:tblPr>
+    <w:tblStylePr w:type="firstRow">
+      <w:rPr>
+        <w:b/>
+        <w:bCs/>
+        <w:color w:val="FFFFFF" w:themeColor="background1"/>
+      </w:rPr>
+      <w:tblPr/>
+      <w:tcPr>
+        <w:tcBorders>
+          <w:top w:val="single" w:sz="4" w:space="0" w:color="AD84C6" w:themeColor="accent1"/>
+          <w:left w:val="single" w:sz="4" w:space="0" w:color="AD84C6" w:themeColor="accent1"/>
+          <w:bottom w:val="single" w:sz="4" w:space="0" w:color="AD84C6" w:themeColor="accent1"/>
+          <w:right w:val="single" w:sz="4" w:space="0" w:color="AD84C6" w:themeColor="accent1"/>
+          <w:insideH w:val="nil"/>
+        </w:tcBorders>
+        <w:shd w:val="clear" w:color="auto" w:fill="AD84C6" w:themeFill="accent1"/>
+      </w:tcPr>
+    </w:tblStylePr>
+    <w:tblStylePr w:type="lastRow">
+      <w:rPr>
+        <w:b/>
+        <w:bCs/>
+      </w:rPr>
+      <w:tblPr/>
+      <w:tcPr>
+        <w:tcBorders>
+          <w:top w:val="double" w:sz="4" w:space="0" w:color="CDB5DC" w:themeColor="accent1" w:themeTint="99"/>
+        </w:tcBorders>
+      </w:tcPr>
+    </w:tblStylePr>
+    <w:tblStylePr w:type="firstCol">
+      <w:rPr>
+        <w:b/>
+        <w:bCs/>
+      </w:rPr>
+    </w:tblStylePr>
+    <w:tblStylePr w:type="lastCol">
+      <w:rPr>
+        <w:b/>
+        <w:bCs/>
+      </w:rPr>
+    </w:tblStylePr>
+    <w:tblStylePr w:type="band1Vert">
+      <w:tblPr/>
+      <w:tcPr>
+        <w:shd w:val="clear" w:color="auto" w:fill="EEE6F3" w:themeFill="accent1" w:themeFillTint="33"/>
+      </w:tcPr>
+    </w:tblStylePr>
+    <w:tblStylePr w:type="band1Horz">
+      <w:tblPr/>
+      <w:tcPr>
+        <w:shd w:val="clear" w:color="auto" w:fill="EEE6F3" w:themeFill="accent1" w:themeFillTint="33"/>
+      </w:tcPr>
+    </w:tblStylePr>
+  </w:style>
 </w:styles>
 </file>
 
 <file path=word/theme/theme1.xml><?xml version="1.0" encoding="utf-8"?>
 <a:theme xmlns:a="http://schemas.openxmlformats.org/drawingml/2006/main" name="Kantoorthema">
   <a:themeElements>
-    <a:clrScheme name="Office">
+    <a:clrScheme name="Violet">
       <a:dk1>
         <a:sysClr val="windowText" lastClr="000000"/>
       </a:dk1>
@@ -1518,34 +2016,34 @@
         <a:sysClr val="window" lastClr="FFFFFF"/>
       </a:lt1>
       <a:dk2>
-        <a:srgbClr val="0E2841"/>
+        <a:srgbClr val="373545"/>
       </a:dk2>
       <a:lt2>
-        <a:srgbClr val="E8E8E8"/>
+        <a:srgbClr val="DCD8DC"/>
       </a:lt2>
       <a:accent1>
-        <a:srgbClr val="156082"/>
+        <a:srgbClr val="AD84C6"/>
       </a:accent1>
       <a:accent2>
-        <a:srgbClr val="E97132"/>
+        <a:srgbClr val="8784C7"/>
       </a:accent2>
       <a:accent3>
-        <a:srgbClr val="196B24"/>
+        <a:srgbClr val="5D739A"/>
       </a:accent3>
       <a:accent4>
-        <a:srgbClr val="0F9ED5"/>
+        <a:srgbClr val="6997AF"/>
       </a:accent4>
       <a:accent5>
-        <a:srgbClr val="A02B93"/>
+        <a:srgbClr val="84ACB6"/>
       </a:accent5>
       <a:accent6>
-        <a:srgbClr val="4EA72E"/>
+        <a:srgbClr val="6F8183"/>
       </a:accent6>
       <a:hlink>
-        <a:srgbClr val="467886"/>
+        <a:srgbClr val="69A020"/>
       </a:hlink>
       <a:folHlink>
-        <a:srgbClr val="96607D"/>
+        <a:srgbClr val="8C8C8C"/>
       </a:folHlink>
     </a:clrScheme>
     <a:fontScheme name="Office">

</xml_diff>